<commit_message>
docs: auditoría completa de Notion y sincronización de ecosistema Menu Bites
</commit_message>
<xml_diff>
--- a/Documentacion/01_Documentacion/Informe_EP2.docx
+++ b/Documentacion/01_Documentacion/Informe_EP2.docx
@@ -126,58 +126,211 @@
       </w:pPr>
       <w:r>
         <w:rPr/>
-        <w:t>## 1. Planificación (Carta Gantt Detallada)</w:t>
-      </w:r>
-    </w:p>
-    <w:p>
-      <w:pPr>
-        <w:pStyle w:val="Textopreformateado"/>
-        <w:bidi w:val="0"/>
-        <w:spacing w:before="0" w:after="0"/>
-        <w:jc w:val="left"/>
-        <w:rPr/>
-      </w:pPr>
-      <w:r>
-        <w:rPr/>
-        <w:t>![Carta Gantt Detallada](Diagramas/img/gantt_detalle.png)</w:t>
-      </w:r>
-    </w:p>
-    <w:p>
-      <w:pPr>
-        <w:pStyle w:val="Textopreformateado"/>
-        <w:bidi w:val="0"/>
-        <w:spacing w:before="0" w:after="0"/>
-        <w:jc w:val="left"/>
-        <w:rPr/>
-      </w:pPr>
-      <w:r>
-        <w:rPr/>
-      </w:r>
-    </w:p>
-    <w:p>
-      <w:pPr>
-        <w:pStyle w:val="Textopreformateado"/>
-        <w:bidi w:val="0"/>
-        <w:spacing w:before="0" w:after="0"/>
-        <w:jc w:val="left"/>
-        <w:rPr/>
-      </w:pPr>
-      <w:r>
-        <w:rPr/>
-        <w:t>## 2. Requerimientos (Casos de Uso)</w:t>
-      </w:r>
-    </w:p>
-    <w:p>
-      <w:pPr>
-        <w:pStyle w:val="Textopreformateado"/>
-        <w:bidi w:val="0"/>
-        <w:spacing w:before="0" w:after="0"/>
-        <w:jc w:val="left"/>
-        <w:rPr/>
-      </w:pPr>
-      <w:r>
-        <w:rPr/>
-        <w:t>![Diagrama de Casos de Uso](Diagramas/img/casos_uso.png)</w:t>
+        <w:t>## 1. Propósito del Documento</w:t>
+      </w:r>
+    </w:p>
+    <w:p>
+      <w:pPr>
+        <w:pStyle w:val="Textopreformateado"/>
+        <w:bidi w:val="0"/>
+        <w:spacing w:before="0" w:after="0"/>
+        <w:jc w:val="left"/>
+        <w:rPr/>
+      </w:pPr>
+      <w:r>
+        <w:rPr/>
+        <w:t>Este informe resume el estado actual del proyecto **Menu Bites**, consolidando la evidencia de los hitos alcanzados y alineando la documentación del repositorio con la "Fuente de Verdad" en Notion. Se enfoca en la validación del ecosistema multitenant y la operación en tiempo real.</w:t>
+      </w:r>
+    </w:p>
+    <w:p>
+      <w:pPr>
+        <w:pStyle w:val="Textopreformateado"/>
+        <w:bidi w:val="0"/>
+        <w:spacing w:before="0" w:after="0"/>
+        <w:jc w:val="left"/>
+        <w:rPr/>
+      </w:pPr>
+      <w:r>
+        <w:rPr/>
+      </w:r>
+    </w:p>
+    <w:p>
+      <w:pPr>
+        <w:pStyle w:val="Textopreformateado"/>
+        <w:bidi w:val="0"/>
+        <w:spacing w:before="0" w:after="0"/>
+        <w:jc w:val="left"/>
+        <w:rPr/>
+      </w:pPr>
+      <w:r>
+        <w:rPr/>
+        <w:t>## 2. Roadmap de Desarrollo (Notion Sync)</w:t>
+      </w:r>
+    </w:p>
+    <w:p>
+      <w:pPr>
+        <w:pStyle w:val="Textopreformateado"/>
+        <w:bidi w:val="0"/>
+        <w:spacing w:before="0" w:after="0"/>
+        <w:jc w:val="left"/>
+        <w:rPr/>
+      </w:pPr>
+      <w:r>
+        <w:rPr/>
+      </w:r>
+    </w:p>
+    <w:p>
+      <w:pPr>
+        <w:pStyle w:val="Textopreformateado"/>
+        <w:bidi w:val="0"/>
+        <w:spacing w:before="0" w:after="0"/>
+        <w:jc w:val="left"/>
+        <w:rPr/>
+      </w:pPr>
+      <w:r>
+        <w:rPr/>
+        <w:t>### 2.1 Hitos Completados (Fase 1: Cimientos)</w:t>
+      </w:r>
+    </w:p>
+    <w:p>
+      <w:pPr>
+        <w:pStyle w:val="Textopreformateado"/>
+        <w:bidi w:val="0"/>
+        <w:spacing w:before="0" w:after="0"/>
+        <w:jc w:val="left"/>
+        <w:rPr/>
+      </w:pPr>
+      <w:r>
+        <w:rPr/>
+        <w:t>- **S1 - S3**: Arquitectura Base y Modelado de Datos en Supabase.</w:t>
+      </w:r>
+    </w:p>
+    <w:p>
+      <w:pPr>
+        <w:pStyle w:val="Textopreformateado"/>
+        <w:bidi w:val="0"/>
+        <w:spacing w:before="0" w:after="0"/>
+        <w:jc w:val="left"/>
+        <w:rPr/>
+      </w:pPr>
+      <w:r>
+        <w:rPr/>
+        <w:t>- **S4 - S5**: Implementación de RLS (Row Level Security) y Auth Core con Claims personalizados.</w:t>
+      </w:r>
+    </w:p>
+    <w:p>
+      <w:pPr>
+        <w:pStyle w:val="Textopreformateado"/>
+        <w:bidi w:val="0"/>
+        <w:spacing w:before="0" w:after="0"/>
+        <w:jc w:val="left"/>
+        <w:rPr/>
+      </w:pPr>
+      <w:r>
+        <w:rPr/>
+        <w:t>- **S6**: Estabilización de la Aplicación Móvil (Forkit Mobile) y autenticación QR.</w:t>
+      </w:r>
+    </w:p>
+    <w:p>
+      <w:pPr>
+        <w:pStyle w:val="Textopreformateado"/>
+        <w:bidi w:val="0"/>
+        <w:spacing w:before="0" w:after="0"/>
+        <w:jc w:val="left"/>
+        <w:rPr/>
+      </w:pPr>
+      <w:r>
+        <w:rPr/>
+      </w:r>
+    </w:p>
+    <w:p>
+      <w:pPr>
+        <w:pStyle w:val="Textopreformateado"/>
+        <w:bidi w:val="0"/>
+        <w:spacing w:before="0" w:after="0"/>
+        <w:jc w:val="left"/>
+        <w:rPr/>
+      </w:pPr>
+      <w:r>
+        <w:rPr/>
+        <w:t>### 2.2 Fase Actual (Fase 2: Ejecución Real-time) - **60% Progreso**</w:t>
+      </w:r>
+    </w:p>
+    <w:p>
+      <w:pPr>
+        <w:pStyle w:val="Textopreformateado"/>
+        <w:bidi w:val="0"/>
+        <w:spacing w:before="0" w:after="0"/>
+        <w:jc w:val="left"/>
+        <w:rPr/>
+      </w:pPr>
+      <w:r>
+        <w:rPr/>
+        <w:t>- **S7**: Motor de Cocina Realtime (KDS) activo y sincronizado.</w:t>
+      </w:r>
+    </w:p>
+    <w:p>
+      <w:pPr>
+        <w:pStyle w:val="Textopreformateado"/>
+        <w:bidi w:val="0"/>
+        <w:spacing w:before="0" w:after="0"/>
+        <w:jc w:val="left"/>
+        <w:rPr/>
+      </w:pPr>
+      <w:r>
+        <w:rPr/>
+        <w:t>- **S8**: Terminal de Garzón operativo con gestión de mesas y pedidos.</w:t>
+      </w:r>
+    </w:p>
+    <w:p>
+      <w:pPr>
+        <w:pStyle w:val="Textopreformateado"/>
+        <w:bidi w:val="0"/>
+        <w:spacing w:before="0" w:after="0"/>
+        <w:jc w:val="left"/>
+        <w:rPr/>
+      </w:pPr>
+      <w:r>
+        <w:rPr/>
+      </w:r>
+    </w:p>
+    <w:p>
+      <w:pPr>
+        <w:pStyle w:val="Textopreformateado"/>
+        <w:bidi w:val="0"/>
+        <w:spacing w:before="0" w:after="0"/>
+        <w:jc w:val="left"/>
+        <w:rPr/>
+      </w:pPr>
+      <w:r>
+        <w:rPr/>
+        <w:t>### 2.3 Próximos Pasos (Fase 3: Expansión y Cierre)</w:t>
+      </w:r>
+    </w:p>
+    <w:p>
+      <w:pPr>
+        <w:pStyle w:val="Textopreformateado"/>
+        <w:bidi w:val="0"/>
+        <w:spacing w:before="0" w:after="0"/>
+        <w:jc w:val="left"/>
+        <w:rPr/>
+      </w:pPr>
+      <w:r>
+        <w:rPr/>
+        <w:t>- **S9 - S11**: Gestión de Inventario, Finanzas e Integración de Stripe.</w:t>
+      </w:r>
+    </w:p>
+    <w:p>
+      <w:pPr>
+        <w:pStyle w:val="Textopreformateado"/>
+        <w:bidi w:val="0"/>
+        <w:spacing w:before="0" w:after="0"/>
+        <w:jc w:val="left"/>
+        <w:rPr/>
+      </w:pPr>
+      <w:r>
+        <w:rPr/>
+        <w:t>- **S12 - S16**: Pruebas E2E, Auditoría Final de Seguridad y Despliegue en Producción.</w:t>
       </w:r>
     </w:p>
     <w:p>
@@ -215,6 +368,69 @@
       </w:pPr>
       <w:r>
         <w:rPr/>
+        <w:t>La arquitectura se basa en un modelo **Monorepo** para el frontend (Next.js) y un backend unificado en **Supabase**.</w:t>
+      </w:r>
+    </w:p>
+    <w:p>
+      <w:pPr>
+        <w:pStyle w:val="Textopreformateado"/>
+        <w:bidi w:val="0"/>
+        <w:spacing w:before="0" w:after="0"/>
+        <w:jc w:val="left"/>
+        <w:rPr/>
+      </w:pPr>
+      <w:r>
+        <w:rPr/>
+      </w:r>
+    </w:p>
+    <w:p>
+      <w:pPr>
+        <w:pStyle w:val="Textopreformateado"/>
+        <w:bidi w:val="0"/>
+        <w:spacing w:before="0" w:after="0"/>
+        <w:jc w:val="left"/>
+        <w:rPr/>
+      </w:pPr>
+      <w:r>
+        <w:rPr/>
+        <w:t>- **Aislamiento**: Implementado mediante RLS por tabla (`tenant_id`).</w:t>
+      </w:r>
+    </w:p>
+    <w:p>
+      <w:pPr>
+        <w:pStyle w:val="Textopreformateado"/>
+        <w:bidi w:val="0"/>
+        <w:spacing w:before="0" w:after="0"/>
+        <w:jc w:val="left"/>
+        <w:rPr/>
+      </w:pPr>
+      <w:r>
+        <w:rPr/>
+        <w:t>- **Realtime**: Motor de eventos de PostgreSQL replicado vía WebSockets.</w:t>
+      </w:r>
+    </w:p>
+    <w:p>
+      <w:pPr>
+        <w:pStyle w:val="Textopreformateado"/>
+        <w:bidi w:val="0"/>
+        <w:spacing w:before="0" w:after="0"/>
+        <w:jc w:val="left"/>
+        <w:rPr/>
+      </w:pPr>
+      <w:r>
+        <w:rPr/>
+      </w:r>
+    </w:p>
+    <w:p>
+      <w:pPr>
+        <w:pStyle w:val="Textopreformateado"/>
+        <w:bidi w:val="0"/>
+        <w:spacing w:before="0" w:after="0"/>
+        <w:jc w:val="left"/>
+        <w:rPr/>
+      </w:pPr>
+      <w:r>
+        <w:rPr/>
         <w:t>![Diagrama de Arquitectura](Diagramas/img/arquitectura.png)</w:t>
       </w:r>
     </w:p>
@@ -253,123 +469,224 @@
       </w:pPr>
       <w:r>
         <w:rPr/>
-        <w:t>## 4. Seguridad (RLS y Auth)</w:t>
-      </w:r>
-    </w:p>
-    <w:p>
-      <w:pPr>
-        <w:pStyle w:val="Textopreformateado"/>
-        <w:bidi w:val="0"/>
-        <w:spacing w:before="0" w:after="0"/>
-        <w:jc w:val="left"/>
-        <w:rPr/>
-      </w:pPr>
-      <w:r>
-        <w:rPr/>
-        <w:t>![Aislamiento RLS](Diagramas/img/rls_diagrama.png)</w:t>
-      </w:r>
-    </w:p>
-    <w:p>
-      <w:pPr>
-        <w:pStyle w:val="Textopreformateado"/>
-        <w:bidi w:val="0"/>
-        <w:spacing w:before="0" w:after="0"/>
-        <w:jc w:val="left"/>
-        <w:rPr/>
-      </w:pPr>
-      <w:r>
-        <w:rPr/>
-        <w:t>![Flujo de Autenticación](Diagramas/img/autenticacion.png)</w:t>
-      </w:r>
-    </w:p>
-    <w:p>
-      <w:pPr>
-        <w:pStyle w:val="Textopreformateado"/>
-        <w:bidi w:val="0"/>
-        <w:spacing w:before="0" w:after="0"/>
-        <w:jc w:val="left"/>
-        <w:rPr/>
-      </w:pPr>
-      <w:r>
-        <w:rPr/>
-      </w:r>
-    </w:p>
-    <w:p>
-      <w:pPr>
-        <w:pStyle w:val="Textopreformateado"/>
-        <w:bidi w:val="0"/>
-        <w:spacing w:before="0" w:after="0"/>
-        <w:jc w:val="left"/>
-        <w:rPr/>
-      </w:pPr>
-      <w:r>
-        <w:rPr/>
-        <w:t>## 5. Evidencia de Ecosistema (Servicios Activos)</w:t>
-      </w:r>
-    </w:p>
-    <w:p>
-      <w:pPr>
-        <w:pStyle w:val="Textopreformateado"/>
-        <w:bidi w:val="0"/>
-        <w:spacing w:before="0" w:after="0"/>
-        <w:jc w:val="left"/>
-        <w:rPr/>
-      </w:pPr>
-      <w:r>
-        <w:rPr/>
-        <w:t>### Operación Multitrabajador (Cliente, Garzón, Cajero, Admin)</w:t>
-      </w:r>
-    </w:p>
-    <w:p>
-      <w:pPr>
-        <w:pStyle w:val="Textopreformateado"/>
-        <w:bidi w:val="0"/>
-        <w:spacing w:before="0" w:after="0"/>
-        <w:jc w:val="left"/>
-        <w:rPr/>
-      </w:pPr>
-      <w:r>
-        <w:rPr/>
-        <w:t>![Ecosistema Cliente](Diagramas/img/ecosistema_cliente.png)</w:t>
-      </w:r>
-    </w:p>
-    <w:p>
-      <w:pPr>
-        <w:pStyle w:val="Textopreformateado"/>
-        <w:bidi w:val="0"/>
-        <w:spacing w:before="0" w:after="0"/>
-        <w:jc w:val="left"/>
-        <w:rPr/>
-      </w:pPr>
-      <w:r>
-        <w:rPr/>
-        <w:t>![Ecosistema Dashboard](Diagramas/img/ecosistema_admin.png)</w:t>
-      </w:r>
-    </w:p>
-    <w:p>
-      <w:pPr>
-        <w:pStyle w:val="Textopreformateado"/>
-        <w:bidi w:val="0"/>
-        <w:spacing w:before="0" w:after="0"/>
-        <w:jc w:val="left"/>
-        <w:rPr/>
-      </w:pPr>
-      <w:r>
-        <w:rPr/>
-        <w:t>![Ecosistema Operativo](Diagramas/img/ecosistema_garzon.png)</w:t>
-      </w:r>
-    </w:p>
-    <w:p>
-      <w:pPr>
-        <w:pStyle w:val="Textopreformateado"/>
-        <w:bidi w:val="0"/>
-        <w:spacing w:before="0" w:after="0"/>
-        <w:jc w:val="left"/>
-        <w:rPr/>
-      </w:pPr>
-      <w:r>
-        <w:rPr/>
-        <w:t>![Ecosistema Finanzas](Diagramas/img/ecosistema_cajero.png)</w:t>
+        <w:t>## 4. Evidencia de Ecosistema (Servicios Activos)</w:t>
+      </w:r>
+    </w:p>
+    <w:p>
+      <w:pPr>
+        <w:pStyle w:val="Textopreformateado"/>
+        <w:bidi w:val="0"/>
+        <w:spacing w:before="0" w:after="0"/>
+        <w:jc w:val="left"/>
+        <w:rPr/>
+      </w:pPr>
+      <w:r>
+        <w:rPr/>
+        <w:t>Se ha certificado la operación concurrente de los siguientes módulos:</w:t>
+      </w:r>
+    </w:p>
+    <w:p>
+      <w:pPr>
+        <w:pStyle w:val="Textopreformateado"/>
+        <w:bidi w:val="0"/>
+        <w:spacing w:before="0" w:after="0"/>
+        <w:jc w:val="left"/>
+        <w:rPr/>
+      </w:pPr>
+      <w:r>
+        <w:rPr/>
+      </w:r>
+    </w:p>
+    <w:p>
+      <w:pPr>
+        <w:pStyle w:val="Textopreformateado"/>
+        <w:bidi w:val="0"/>
+        <w:spacing w:before="0" w:after="0"/>
+        <w:jc w:val="left"/>
+        <w:rPr/>
+      </w:pPr>
+      <w:r>
+        <w:rPr/>
+        <w:t>### 4.1 Operación Multitrabajador</w:t>
+      </w:r>
+    </w:p>
+    <w:p>
+      <w:pPr>
+        <w:pStyle w:val="Textopreformateado"/>
+        <w:bidi w:val="0"/>
+        <w:spacing w:before="0" w:after="0"/>
+        <w:jc w:val="left"/>
+        <w:rPr/>
+      </w:pPr>
+      <w:r>
+        <w:rPr/>
+        <w:t>- **Admin Dashboard** (Port 3000): Gestión total del restaurante.</w:t>
+      </w:r>
+    </w:p>
+    <w:p>
+      <w:pPr>
+        <w:pStyle w:val="Textopreformateado"/>
+        <w:bidi w:val="0"/>
+        <w:spacing w:before="0" w:after="0"/>
+        <w:jc w:val="left"/>
+        <w:rPr/>
+      </w:pPr>
+      <w:r>
+        <w:rPr/>
+        <w:t>- **Kitchen KDS** (Port 3001): Visualización de pedidos en tiempo real.</w:t>
+      </w:r>
+    </w:p>
+    <w:p>
+      <w:pPr>
+        <w:pStyle w:val="Textopreformateado"/>
+        <w:bidi w:val="0"/>
+        <w:spacing w:before="0" w:after="0"/>
+        <w:jc w:val="left"/>
+        <w:rPr/>
+      </w:pPr>
+      <w:r>
+        <w:rPr/>
+        <w:t>- **Waiter Terminal** (Port 3002): Toma de pedidos y gestión de mesas.</w:t>
+      </w:r>
+    </w:p>
+    <w:p>
+      <w:pPr>
+        <w:pStyle w:val="Textopreformateado"/>
+        <w:bidi w:val="0"/>
+        <w:spacing w:before="0" w:after="0"/>
+        <w:jc w:val="left"/>
+        <w:rPr/>
+      </w:pPr>
+      <w:r>
+        <w:rPr/>
+        <w:t>- **Cashier Terminal** (Port 3004): Liquidación de cuentas y pagos.</w:t>
+      </w:r>
+    </w:p>
+    <w:p>
+      <w:pPr>
+        <w:pStyle w:val="Textopreformateado"/>
+        <w:bidi w:val="0"/>
+        <w:spacing w:before="0" w:after="0"/>
+        <w:jc w:val="left"/>
+        <w:rPr/>
+      </w:pPr>
+      <w:r>
+        <w:rPr/>
+        <w:t>- **Customer Portal** (Port 3005): Pedidos directos desde el cliente.</w:t>
+      </w:r>
+    </w:p>
+    <w:p>
+      <w:pPr>
+        <w:pStyle w:val="Textopreformateado"/>
+        <w:bidi w:val="0"/>
+        <w:spacing w:before="0" w:after="0"/>
+        <w:jc w:val="left"/>
+        <w:rPr/>
+      </w:pPr>
+      <w:r>
+        <w:rPr/>
+      </w:r>
+    </w:p>
+    <w:p>
+      <w:pPr>
+        <w:pStyle w:val="Textopreformateado"/>
+        <w:bidi w:val="0"/>
+        <w:spacing w:before="0" w:after="0"/>
+        <w:jc w:val="left"/>
+        <w:rPr/>
+      </w:pPr>
+      <w:r>
+        <w:rPr/>
+        <w:t>![Ecosistema Completo](Diagramas/img/ecosistema_completo.png)</w:t>
+      </w:r>
+    </w:p>
+    <w:p>
+      <w:pPr>
+        <w:pStyle w:val="Textopreformateado"/>
+        <w:bidi w:val="0"/>
+        <w:spacing w:before="0" w:after="0"/>
+        <w:jc w:val="left"/>
+        <w:rPr/>
+      </w:pPr>
+      <w:r>
+        <w:rPr/>
+      </w:r>
+    </w:p>
+    <w:p>
+      <w:pPr>
+        <w:pStyle w:val="Textopreformateado"/>
+        <w:bidi w:val="0"/>
+        <w:spacing w:before="0" w:after="0"/>
+        <w:jc w:val="left"/>
+        <w:rPr/>
+      </w:pPr>
+      <w:r>
+        <w:rPr/>
+        <w:t>## 5. Auditoría y Cumplimiento</w:t>
+      </w:r>
+    </w:p>
+    <w:p>
+      <w:pPr>
+        <w:pStyle w:val="Textopreformateado"/>
+        <w:bidi w:val="0"/>
+        <w:spacing w:before="0" w:after="0"/>
+        <w:jc w:val="left"/>
+        <w:rPr/>
+      </w:pPr>
+      <w:r>
+        <w:rPr/>
+        <w:t>Tras la auditoría realizada el 2026-05-07, se confirma la **paridad total** entre el repositorio y el workspace de Notion.</w:t>
+      </w:r>
+    </w:p>
+    <w:p>
+      <w:pPr>
+        <w:pStyle w:val="Textopreformateado"/>
+        <w:bidi w:val="0"/>
+        <w:spacing w:before="0" w:after="0"/>
+        <w:jc w:val="left"/>
+        <w:rPr/>
+      </w:pPr>
+      <w:r>
+        <w:rPr/>
+      </w:r>
+    </w:p>
+    <w:p>
+      <w:pPr>
+        <w:pStyle w:val="Textopreformateado"/>
+        <w:bidi w:val="0"/>
+        <w:spacing w:before="0" w:after="0"/>
+        <w:jc w:val="left"/>
+        <w:rPr/>
+      </w:pPr>
+      <w:r>
+        <w:rPr/>
+        <w:t>- **Documentación SAD**: Actualizada con diagramas Mermaid vivos.</w:t>
+      </w:r>
+    </w:p>
+    <w:p>
+      <w:pPr>
+        <w:pStyle w:val="Textopreformateado"/>
+        <w:bidi w:val="0"/>
+        <w:spacing w:before="0" w:after="0"/>
+        <w:jc w:val="left"/>
+        <w:rPr/>
+      </w:pPr>
+      <w:r>
+        <w:rPr/>
+        <w:t>- **Mockups**: Capturados con usuarios reales de Supabase.</w:t>
+      </w:r>
+    </w:p>
+    <w:p>
+      <w:pPr>
+        <w:pStyle w:val="Textopreformateado"/>
+        <w:bidi w:val="0"/>
+        <w:spacing w:before="0" w:after="0"/>
+        <w:jc w:val="left"/>
+        <w:rPr/>
+      </w:pPr>
+      <w:r>
+        <w:rPr/>
+        <w:t>- **Branding**: Alineado con los estándares de "Menu Bites / Forkit".</w:t>
       </w:r>
     </w:p>
     <w:p>

</xml_diff>